<commit_message>
fix: correct IA cost total rounding (7.1322 -> 7.1359) and downstream BRL values
Phase IA costs sum to 7.1359, not 7.1322. Updated total in Camada 1
table and adjusted ANALISE_COMPARATIVA values: tokens R$ 35.68,
total R$ 1158.18, saving R$ 4604.32. Regenerated docx.
</commit_message>
<xml_diff>
--- a/Relatorio_Final_Equipe3.docx
+++ b/Relatorio_Final_Equipe3.docx
@@ -3475,7 +3475,7 @@
               <w:rPr>
                 <w:rFonts w:ascii="Montserrat" w:hAnsi="Montserrat" w:eastAsia="Montserrat"/>
               </w:rPr>
-              <w:t>7,1322</w:t>
+              <w:t>7,1359</w:t>
             </w:r>
           </w:p>
         </w:tc>
@@ -4567,7 +4567,7 @@
         <w:rPr>
           <w:rFonts w:ascii="Montserrat" w:hAnsi="Montserrat" w:eastAsia="Montserrat"/>
         </w:rPr>
-        <w:t>Custo total com IA (R$): R$ 1.158,16 (tokens: R$ 35,66 + horas humanas: R$ 1.122,50)</w:t>
+        <w:t>Custo total com IA (R$): R$ 1.158,18 (tokens: R$ 35,68 + horas humanas: R$ 1.122,50)</w:t>
       </w:r>
     </w:p>
     <w:p>
@@ -4657,7 +4657,7 @@
         <w:rPr>
           <w:rFonts w:ascii="Montserrat" w:hAnsi="Montserrat" w:eastAsia="Montserrat"/>
         </w:rPr>
-        <w:t>Saving estimado (R$): R$ 4.604,34</w:t>
+        <w:t>Saving estimado (R$): R$ 4.604,32</w:t>
       </w:r>
     </w:p>
     <w:p>

</xml_diff>